<commit_message>
Rewrite handover documents to remove development-process language
Neutralized internal references (e.g. "this session," "prior session task")
in the three handover DOCX files to read as standard professional project
documentation. No technical facts, statuses, evidence, code references, or
document structure were changed.

Co-Authored-By: Claude Sonnet 5 <noreply@anthropic.com>
Claude-Session: https://claude.ai/code/session_01RGm3cRTsXfsPBJvrD2y6aH
</commit_message>
<xml_diff>
--- a/handover-documentation/Aculyze-LM_End_to_End_User_Flow_and_User_Guide.docx
+++ b/handover-documentation/Aculyze-LM_End_to_End_User_Flow_and_User_Guide.docx
@@ -917,7 +917,7 @@
           <w:sz w:val="21"/>
           <w:szCs w:val="21"/>
         </w:rPr>
-        <w:t xml:space="preserve">Aculyze-LM is a Filament 3 admin panel — there is no separate public-facing site. A user logs in with their email and password at the panel's login screen; there is no self-registration, no "forgot password" flow wired to a working mailer that was verified in this review (the password_reset_tokens table exists but sending a reset email was not confirmed configured — Needs verification), and no social/SSO login.</w:t>
+        <w:t xml:space="preserve">Aculyze-LM is a Filament 3 admin panel — there is no separate public-facing site. A user logs in with their email and password at the panel's login screen; there is no self-registration, no "forgot password" flow confirmed wired to a working mailer (the password_reset_tokens table exists but sending a reset email was not confirmed configured — Needs verification), and no social/SSO login.</w:t>
       </w:r>
     </w:p>
     <w:p>
@@ -3469,7 +3469,7 @@
           <w:sz w:val="20"/>
           <w:szCs w:val="20"/>
         </w:rPr>
-        <w:t xml:space="preserve">screenshots of the live application are not included in this document. Producing accurate ones would require a running instance seeded with realistic, non-confidential sample data, which was outside the scope of this documentation-only handover task; the field names, labels, and behaviors described throughout this guide were instead verified directly against the current Filament Resource/Page source code.</w:t>
+        <w:t xml:space="preserve">screenshots of the live application are not included in this document. Producing accurate ones would require a running instance seeded with realistic, non-confidential sample data, which was outside the scope of this documentation set; the field names, labels, and behaviors described throughout this guide were instead verified directly against the current Filament Resource/Page source code.</w:t>
       </w:r>
     </w:p>
     <w:sectPr>

</xml_diff>